<commit_message>
Use uploaded original Maze Runner before recording
</commit_message>
<xml_diff>
--- a/lab-04/Lab_4_Report.docx
+++ b/lab-04/Lab_4_Report.docx
@@ -47,7 +47,7 @@
     </w:p>
     <w:p>
       <w:r>
-        <w:t>I reviewed the starter README, corrected player collision detection, implemented the four listed features, and ran Python compilation plus headless Pygame assertions. I also recorded a genuine 10-second capture of the running game after the changes. The assignment asks for a recording from before changes; none was made before this work, so I have not created or labeled a substitute as a before video.</w:t>
+        <w:t>I reviewed the starter README, corrected player collision detection, implemented the four listed features, and ran Python compilation plus headless Pygame assertions. I also recorded a genuine 10-second capture of the running game after the changes. The original, unmodified Maze Runner was recorded before changes. The genuine 11.9-second before video is included in this submission.</w:t>
       </w:r>
     </w:p>
     <w:p>
@@ -348,7 +348,7 @@
     </w:p>
     <w:p>
       <w:r>
-        <w:t>Compilation and targeted runtime checks passed for collision handling, BFS hints, fog visibility, sorted leaderboard persistence, and all difficulty dimensions. The after-change video and updated code package are included with this report. A genuine before-change video is unavailable because recording began after the code had already been modified; the configured Git remote is the shared assigned repository, so no push was made to it.</w:t>
+        <w:t>Compilation and targeted runtime checks passed for collision handling, BFS hints, fog visibility, sorted leaderboard persistence, and all difficulty dimensions. The original starter-game recording is included as the before video. The after video will be captured from a fresh updated-game session after the student records it.</w:t>
       </w:r>
     </w:p>
     <w:sectPr>

</xml_diff>